<commit_message>
Fix HTML entities (&amp; -> &) in Markdown headings and table content
Agent-Logs-Url: https://github.com/Ahmad-Codemaster/CoRide_secure-carporate-carpooling_Version1.0.1/sessions/c693253d-5e62-4a2e-9f1d-78b1b9652589

Co-authored-by: Ahmad-Codemaster <243356652+Ahmad-Codemaster@users.noreply.github.com>
</commit_message>
<xml_diff>
--- a/docs/FYP_Chapter6_7.docx
+++ b/docs/FYP_Chapter6_7.docx
@@ -41,7 +41,7 @@
           <w:b/>
           <w:sz w:val="28"/>
         </w:rPr>
-        <w:t>Chapter 6: Testing (Software Quality Attributes) &amp;amp; Chapter 7: Tools and Technologies</w:t>
+        <w:t>Chapter 6: Testing (Software Quality Attributes) &amp; Chapter 7: Tools and Technologies</w:t>
       </w:r>
     </w:p>
     <w:p/>
@@ -1873,7 +1873,7 @@
                 <w:rFonts w:ascii="Times New Roman" w:hAnsi="Times New Roman"/>
                 <w:sz w:val="22"/>
               </w:rPr>
-              <w:t>Ride Completion &amp;amp; Rating</w:t>
+              <w:t>Ride Completion &amp; Rating</w:t>
             </w:r>
           </w:p>
         </w:tc>

</xml_diff>